<commit_message>
feat: release zip + legible CONFIRM wind readout; design intent refreshed
- WINDWARD_submission.zip (0.50 MB / 35 limit): index.html at top
  level, vendor/ (three.min.js, Water.js, waternormals.jpg),
  design-intent.docx, buildlog.md. Verified by formal offline test:
  fresh extraction, file:// load, ZERO non-file network requests, no
  page errors, a real minute of play (wave launches, AI builds).
  Anonymity scans clean (no names, no URLs, page title WINDWARD).
- CONFIRM on a placement ghost now says what its number means (player
  asked): "CONFIRM - HEADWIND x0.57" / FAIR WIND / TAILWIND, banded by
  the wind law's closure threshold.
- design-intent.docx refreshed (494 words): the wind law (loops
  circulate) and the guaranteed verdict (wrath tides, Zeus) replace
  stale nine-and-done claims.

Co-Authored-By: Claude Fable 5 <noreply@anthropic.com>
Claude-Session: https://claude.ai/code/session_01NjEpo5MjLFBKVLFNZET6tb
</commit_message>
<xml_diff>
--- a/docs/design-intent.docx
+++ b/docs/design-intent.docx
@@ -94,7 +94,7 @@
     <w:p>
       <w:pPr/>
       <w:r>
-        <w:t xml:space="preserve">The enemy obeys the same law: every lane he lays traces home to a temple, and an automated proof in the repository verifies it on every build. The hard constraint is the clock — the tide comes nine times, each further and harder. Omnidirectional guns hold ground; sector guns are aimed at placement, forever. Physical things cost coin, wind-magic costs Favor, and what is both costs both.</w:t>
+        <w:t xml:space="preserve">Every enemy lane traces home to a temple — an automated proof verifies it on every build. The deeper law is the wind: fleets ride only favorable channels — build a loop and the flow becomes a loop. The clock is the tide: nine authored waves, then his wrath until a temple falls, or Zeus rules for the survivor. Every match ends with a verdict. Sector guns are aimed at placement, forever. Physical things cost coin, wind-magic costs Favor; what is both costs both.</w:t>
       </w:r>
     </w:p>
     <w:p>
@@ -113,7 +113,7 @@
     <w:p>
       <w:pPr/>
       <w:r>
-        <w:t xml:space="preserve">Both sides playable (a presentation mirror over one proven simulation). A seeded, validated archipelago several screens wide — type a seed to replay it. Placement, support graph, progressive collapse, reconnection, salvage, kill bounties. Mining, hauling, depletion, ships adrift on a live wind field. Temples, influence, priests who walk their islands. Nine authored waves with a scripted fifth-tide strike, Tidal Surge, Fog Bank, the Age of Wrath, a garrisoning enemy. Reflective water flowing with the wind, storm surges, cloud-bank fog. All art procedural; all audio synthesised; no network requests.</w:t>
+        <w:t xml:space="preserve">Both sides playable (a presentation mirror over one proven simulation). A seeded, validated archipelago — type a seed to replay it. Support graph, progressive collapse, reconnection, salvage, bounties; mining, hauling, depletion, ships adrift on a live wind field; temples, influence, priests. Nine authored waves with a scripted fifth-tide strike, the Age of Wrath, a garrisoning enemy that never corks its own lanes. Reflective water flowing with the wind; visible current in every channel. All art procedural; all audio synthesised; no network requests.</w:t>
       </w:r>
     </w:p>
     <w:p>
@@ -132,7 +132,7 @@
     <w:p>
       <w:pPr/>
       <w:r>
-        <w:t xml:space="preserve">First session, beat by beat: 0:05 the first path. 0:45 the first tide breaks on new guns. 1:30 the priest claims an island; Favor begins. 3:00 the fleet upgrade tempts — double cargo, bigger targets. 4:05 the fifth tide strikes your farthest tower by script. 6:00 the Age of Wrath. 7:00 the last tide only says: come down. The twist to validate is progressive collapse — defences are joints in a supply network, one death can unravel the branch behind it, and the player can still save it. Balance is priced by simulation: scripted-match sweeps set every constant, and every mechanics change re-runs them.</w:t>
+        <w:t xml:space="preserve">First session, beat by beat: 0:05 the first path. 0:45 the first tide breaks on new guns. 1:30 the priest claims an island; Favor begins. 3:00 the fleet upgrade tempts — double cargo, bigger targets. 4:05 the fifth tide strikes your farthest tower by script. 6:00 the Age of Wrath. 7:00 the last tide only says: come down. The twist to validate: defences are joints in a supply network — one death can unravel the branch behind it, and the player can still save it. Balance is priced by simulation: scripted-match sweeps set every constant.</w:t>
       </w:r>
     </w:p>
     <w:p>

</xml_diff>

<commit_message>
docs: design intent "how to play" states the loop plainly (player-directed)
Lay bound-air paths; hang defenses and gun batteries on their open
ends; claim islands with priest + temple; moor haulers at yards and
upgrade the fleet to hydrogen. 497 words. Zip refreshed.

Co-Authored-By: Claude Fable 5 <noreply@anthropic.com>
Claude-Session: https://claude.ai/code/session_01NjEpo5MjLFBKVLFNZET6tb
</commit_message>
<xml_diff>
--- a/docs/design-intent.docx
+++ b/docs/design-intent.docx
@@ -50,7 +50,7 @@
     <w:p>
       <w:pPr/>
       <w:r>
-        <w:t xml:space="preserve">For players who love logistics and spatial problems: route-building, network defense. The guild has learned to fly; the sea god is passed over, and his tide comes nine times to collect. You are the Windwright. Bind the air.</w:t>
+        <w:t xml:space="preserve">For players who love logistics and spatial problems: route-building, network defense. The guild has learned to fly; the sea god is passed over, and his tide comes nine times to collect. You are the Windwright.</w:t>
       </w:r>
     </w:p>
     <w:p>
@@ -69,7 +69,7 @@
     <w:p>
       <w:pPr/>
       <w:r>
-        <w:t xml:space="preserve">Portrait, one thumb; mouse supported. Gold markers glow wherever you can act; tapping opens a menu at the thumb — path pieces that fit there, buildings explained in a line, powers, salvage. Turn the ghost, confirm. Tap anything and it names itself, down to which of the four winds rules that patch of sea. A guided first-play tutorial points at each touch; WATCH A MATCH is a wordless second teacher — an AI plays the real interface, each button lighting as it presses it. Leaving saves the match; the title offers resume.</w:t>
+        <w:t xml:space="preserve">Portrait, one thumb; mouse supported. Lay paths of bound air out from your temple; hang defenses and gun batteries on their open ends. Send your priest to an island and raise a temple to claim it. Moor haulers at yards; upgrade the fleet to hydrogen. Gold markers glow wherever you can act; tapping opens a menu at the thumb — turn the ghost, confirm. Tap anything and it names itself. A guided tutorial points at each touch; WATCH A MATCH is a wordless second teacher — an AI plays the real interface, each button lighting as it presses it. Leaving saves the match; the title offers resume.</w:t>
       </w:r>
     </w:p>
     <w:p>
@@ -88,7 +88,7 @@
     <w:p>
       <w:pPr/>
       <w:r>
-        <w:t xml:space="preserve">One road, five jobs. A single system carries the whole game — the bound road. It is movement (everything rides it), income (islands it touches are mined; haulers land the ore), reach (only the road lifts fog and grants ground), attack surface (the raw ends and their capping towers are the joints), and drama (a severed branch visibly unbinds segment by segment while you race to reconnect).</w:t>
+        <w:t xml:space="preserve">One road, five jobs. A single system carries the whole game — the bound road. It is movement (everything rides it), income (islands it touches are mined; haulers land the ore), reach (only the road lifts fog), attack surface (raw ends and their capping towers are the joints), and drama (a severed branch visibly unbinds while you race to reconnect).</w:t>
       </w:r>
     </w:p>
     <w:p>
@@ -132,7 +132,7 @@
     <w:p>
       <w:pPr/>
       <w:r>
-        <w:t xml:space="preserve">First session: 0:05 the first path. 0:45 the first tide breaks on new guns. 1:30 the priest claims an island; Favor begins. 3:00 the fleet upgrade tempts. 4:05 the fifth tide strikes your farthest tower by script. 6:00 the Age of Wrath. 7:00 the last tide says: come down. The twist to validate: defences are joints in a supply network — one death can unravel the branch behind it, and the player can still save it. Balance is priced by simulation sweeps.</w:t>
+        <w:t xml:space="preserve">First session: 0:05 the first path. 0:45 the first tide breaks on new guns. 1:30 the priest claims an island; Favor begins. 3:00 the fleet upgrade tempts. 4:05 the fifth tide strikes your farthest tower. 6:00 the Age of Wrath. 7:00 the last tide says: come down. The twist to validate: defences are joints in a supply network — one death can unravel the branch behind it, and the player can still save it. Balance is priced by simulation sweeps.</w:t>
       </w:r>
     </w:p>
     <w:p>
@@ -151,7 +151,7 @@
     <w:p>
       <w:pPr/>
       <w:r>
-        <w:t xml:space="preserve">Four priesthoods building networks across the lots the gods drew — sky, sea, land, underworld — causeways blocking lanes, Zeus’s weather over all of it.</w:t>
+        <w:t xml:space="preserve">Four priesthoods building networks across the lots the gods drew — sky, sea, land, underworld — under Zeus’s weather.</w:t>
       </w:r>
     </w:p>
   </w:body>

</xml_diff>